<commit_message>
feat(word): complete caption repairs and full thesis validation
</commit_message>
<xml_diff>
--- a/tests/fixtures/synthetic/full-thesis/synthetic_complete_thesis.docx
+++ b/tests/fixtures/synthetic/full-thesis/synthetic_complete_thesis.docx
@@ -983,7 +983,7 @@
     </w:p>
     <w:p>
       <w:pPr>
-        <w:spacing w:before="100" w:after="140"/>
+        <w:spacing w:before="120" w:after="120" w:line="240" w:lineRule="auto"/>
         <w:ind w:firstLine="0"/>
         <w:jc w:val="center"/>
       </w:pPr>
@@ -992,7 +992,7 @@
           <w:rFonts w:ascii="Times New Roman" w:hAnsi="Times New Roman" w:eastAsia="宋体"/>
           <w:sz w:val="21"/>
         </w:rPr>
-        <w:t>表 3-1 观察变量与计算口径</w:t>
+        <w:t>表3.1　观察变量与计算口径</w:t>
       </w:r>
     </w:p>
     <w:tbl>
@@ -1657,7 +1657,7 @@
     </w:p>
     <w:p>
       <w:pPr>
-        <w:spacing w:before="100" w:after="140"/>
+        <w:spacing w:before="120" w:after="120" w:line="240" w:lineRule="auto"/>
         <w:ind w:firstLine="0"/>
         <w:jc w:val="center"/>
       </w:pPr>
@@ -1666,7 +1666,7 @@
           <w:rFonts w:ascii="Times New Roman" w:hAnsi="Times New Roman" w:eastAsia="宋体"/>
           <w:sz w:val="21"/>
         </w:rPr>
-        <w:t>表 4-1 合成样本的区域汇总指标</w:t>
+        <w:t>表4.1　合成样本的区域汇总指标</w:t>
       </w:r>
     </w:p>
     <w:tbl>
@@ -2145,20 +2145,6 @@
     </w:tbl>
     <w:p>
       <w:pPr>
-        <w:spacing w:before="100" w:after="140"/>
-        <w:ind w:firstLine="0"/>
-        <w:jc w:val="center"/>
-      </w:pPr>
-      <w:r>
-        <w:rPr>
-          <w:rFonts w:ascii="Times New Roman" w:hAnsi="Times New Roman" w:eastAsia="宋体"/>
-          <w:sz w:val="21"/>
-        </w:rPr>
-        <w:t>图 4-1 不同时段的合成平均占用水平</w:t>
-      </w:r>
-    </w:p>
-    <w:p>
-      <w:pPr>
         <w:jc w:val="center"/>
       </w:pPr>
       <w:r>
@@ -2198,7 +2184,21 @@
     </w:p>
     <w:p>
       <w:pPr>
-        <w:spacing w:before="100" w:after="140"/>
+        <w:spacing w:before="0" w:after="0" w:line="360" w:lineRule="auto"/>
+        <w:ind w:firstLine="0"/>
+        <w:jc w:val="left"/>
+      </w:pPr>
+      <w:r>
+        <w:rPr>
+          <w:rFonts w:ascii="Times New Roman" w:hAnsi="Times New Roman" w:eastAsia="黑体"/>
+          <w:sz w:val="24"/>
+        </w:rPr>
+        <w:t>图4.1　不同时段的合成平均占用水平</w:t>
+      </w:r>
+    </w:p>
+    <w:p>
+      <w:pPr>
+        <w:spacing w:before="120" w:after="120" w:line="240" w:lineRule="auto"/>
         <w:ind w:firstLine="0"/>
         <w:jc w:val="center"/>
       </w:pPr>
@@ -2207,7 +2207,7 @@
           <w:rFonts w:ascii="Times New Roman" w:hAnsi="Times New Roman" w:eastAsia="宋体"/>
           <w:sz w:val="21"/>
         </w:rPr>
-        <w:t>表 4-2 数据质量检查结果（合成样本）</w:t>
+        <w:t>表4.2　数据质量检查结果（合成样本）</w:t>
       </w:r>
     </w:p>
     <w:tbl>
@@ -2658,20 +2658,6 @@
     </w:tbl>
     <w:p>
       <w:pPr>
-        <w:spacing w:before="100" w:after="140"/>
-        <w:ind w:firstLine="0"/>
-        <w:jc w:val="center"/>
-      </w:pPr>
-      <w:r>
-        <w:rPr>
-          <w:rFonts w:ascii="Times New Roman" w:hAnsi="Times New Roman" w:eastAsia="宋体"/>
-          <w:sz w:val="21"/>
-        </w:rPr>
-        <w:t>图 4-2 合成数据处理与复核流程</w:t>
-      </w:r>
-    </w:p>
-    <w:p>
-      <w:pPr>
         <w:jc w:val="center"/>
       </w:pPr>
       <w:r>
@@ -2707,6 +2693,20 @@
             </a:graphic>
           </wp:inline>
         </w:drawing>
+      </w:r>
+    </w:p>
+    <w:p>
+      <w:pPr>
+        <w:spacing w:before="120" w:after="240" w:line="240" w:lineRule="auto"/>
+        <w:ind w:firstLine="0"/>
+        <w:jc w:val="center"/>
+      </w:pPr>
+      <w:r>
+        <w:rPr>
+          <w:rFonts w:ascii="Times New Roman" w:hAnsi="Times New Roman" w:eastAsia="宋体"/>
+          <w:sz w:val="21"/>
+        </w:rPr>
+        <w:t>图4.2　合成数据处理与复核流程</w:t>
       </w:r>
     </w:p>
     <w:p>
@@ -3126,7 +3126,7 @@
     </w:p>
     <w:p>
       <w:pPr>
-        <w:spacing w:before="100" w:after="140"/>
+        <w:spacing w:before="120" w:after="120" w:line="240" w:lineRule="auto"/>
         <w:ind w:firstLine="0"/>
         <w:jc w:val="center"/>
       </w:pPr>
@@ -3135,7 +3135,7 @@
           <w:rFonts w:ascii="Times New Roman" w:hAnsi="Times New Roman" w:eastAsia="宋体"/>
           <w:sz w:val="21"/>
         </w:rPr>
-        <w:t>表 A-1 合成记录字段字典</w:t>
+        <w:t>表A.1　合成记录字段字典</w:t>
       </w:r>
     </w:p>
     <w:tbl>

</xml_diff>